<commit_message>
updated docs (aside from diagrams)
</commit_message>
<xml_diff>
--- a/Docs/Test Report.docx
+++ b/Docs/Test Report.docx
@@ -468,7 +468,19 @@
         <w:rPr>
           <w:lang w:val="en-GB"/>
         </w:rPr>
-        <w:t>11 test classes covering various components</w:t>
+        <w:t>1</w:t>
+      </w:r>
+      <w:r>
+        <w:rPr>
+          <w:lang w:val="en-GB"/>
+        </w:rPr>
+        <w:t>2</w:t>
+      </w:r>
+      <w:r>
+        <w:rPr>
+          <w:lang w:val="en-GB"/>
+        </w:rPr>
+        <w:t xml:space="preserve"> test classes covering various components</w:t>
       </w:r>
       <w:r>
         <w:rPr>
@@ -480,7 +492,13 @@
         <w:rPr>
           <w:lang w:val="en-GB"/>
         </w:rPr>
-        <w:t>36 total test methods (all currently passing)</w:t>
+        <w:t>59</w:t>
+      </w:r>
+      <w:r>
+        <w:rPr>
+          <w:lang w:val="en-GB"/>
+        </w:rPr>
+        <w:t xml:space="preserve"> total test methods (all currently passing)</w:t>
       </w:r>
     </w:p>
     <w:p>

</xml_diff>